<commit_message>
Update exercises and resources for GPO workshop, including file name changes and content adjustments
</commit_message>
<xml_diff>
--- a/files/CPALL_Lab_Word_OpsReport_Source.docx
+++ b/files/CPALL_Lab_Word_OpsReport_Source.docx
@@ -7,7 +7,7 @@
         <w:pStyle w:val="Heading1"/>
       </w:pPr>
       <w:r>
-        <w:t>ข้อมูลต้นทางสำหรับ Lab: รายงานปฏิบัติการศูนย์กระจายสินค้า (ตัวอย่างเสมือนจริง)</w:t>
+        <w:t>ข้อมูลต้นทางสำหรับ Lab: รายงานความต่อเนื่องการผลิตและกระจายยา GPO (ตัวอย่างเสมือนจริง)</w:t>
       </w:r>
     </w:p>
     <w:p>
@@ -28,32 +28,32 @@
     </w:p>
     <w:p>
       <w:r>
-        <w:t>• ช่วงวันที่: 1–28 ก.พ. 2026 (ข้อมูลรวม 4 DC: บางบัวทอง, ลาดกระบัง, เชียงใหม่, ขอนแก่น)</w:t>
+        <w:t>• ช่วงวันที่: 1–28 มี.ค. 2026 (ข้อมูลรวม 4 หน่วยงาน: โรงงานรังสิต, QA/QC กลาง, คลังราชเทวี, คลังขอนแก่น)</w:t>
       </w:r>
     </w:p>
     <w:p>
       <w:r>
-        <w:t>• ประเด็นหลัก: 1) ตรงเวลา (On-time) ลดลงที่ DC-บางบัวทอง 2 วัน (10 และ 18 ก.พ.) สาเหตุคาดว่าเกิดจากรถขนส่งไม่พอ + คอขวดจุดคัดแยก</w:t>
+        <w:t>• ประเด็นหลัก: 1) การส่งมอบยากลุ่ม Antibiotic ล่าช้า 2 วัน (11 และ 19 มี.ค.) สาเหตุหลักคือการปล่อยล็อตจาก QA ช้ากว่าปกติ + รถควบคุมอุณหภูมิไม่พอช่วง peak</w:t>
       </w:r>
     </w:p>
     <w:p>
       <w:r>
-        <w:t>• OT พุ่งที่ DC-บางบัวทองในวันเดียวกัน (เพิ่มกำลังคนชั่วคราว)</w:t>
+        <w:t>• OT ทีมคลังเพิ่มขึ้นในวันเดียวกัน เพื่อเร่งแพ็กและจัดส่ง</w:t>
       </w:r>
     </w:p>
     <w:p>
       <w:r>
-        <w:t>• DC-เชียงใหม่มี Fill rate ลดลง 2 ครั้ง (7 และ 21 ก.พ.) สาเหตุจากสินค้าเข้าไม่ตามแผน + vendor lead time ยืด</w:t>
+        <w:t>• อัตราเติมเต็มคำสั่งซื้อของคลังขอนแก่นลดลง 2 ครั้ง (8 และ 22 มี.ค.) จากวัตถุดิบเข้าสายการผลิตไม่ตามแผน + lead time ผู้ขายยืด</w:t>
       </w:r>
     </w:p>
     <w:p>
       <w:r>
-        <w:t>• เหตุการณ์ความปลอดภัย: มี near-miss 3 ครั้ง (ยกของหนัก/ทางเดินแคบ) และ incident 2 ครั้ง (รถโฟล์คลิฟต์เฉี่ยวชั้นวาง)</w:t>
+        <w:t>• เหตุการณ์ความปลอดภัย: near-miss 2 ครั้งในพื้นที่แพ็กยา และ incident 1 ครั้งจากการเคลื่อนย้ายพาเลต</w:t>
       </w:r>
     </w:p>
     <w:p>
       <w:r>
-        <w:t>• ข้อเสนอเบื้องต้น: เพิ่มรอบรับสินค้าช่วง 9:00–11:00, ปรับ route รถขนส่งช่วง peak, และทำ 5S ทางเดินโซนคัดแยก</w:t>
+        <w:t>• ข้อเสนอเบื้องต้น: จัดรอบปล่อยล็อต QA วันละ 2 รอบ, เพิ่มรถควบคุมอุณหภูมิสำรองช่วงเย็น, และปรับ 5S โซนแพ็กยา</w:t>
       </w:r>
     </w:p>
     <w:p>
@@ -71,19 +71,19 @@
     </w:p>
     <w:p>
       <w:r>
-        <w:t>• ผจก. DC-บางบัวทอง: คุณกิตติ</w:t>
+        <w:t>• ผจก. โรงงานรังสิต: คุณกิตติ</w:t>
         <w:br/>
       </w:r>
       <w:r>
-        <w:t>• ผจก. DC-ลาดกระบัง: คุณศศิ</w:t>
+        <w:t>• ผจก. QA/QC กลาง: คุณศศิ</w:t>
         <w:br/>
       </w:r>
       <w:r>
-        <w:t>• ผจก. DC-เชียงใหม่: คุณวีระ</w:t>
+        <w:t>• ผจก. คลังราชเทวี: คุณวีระ</w:t>
         <w:br/>
       </w:r>
       <w:r>
-        <w:t>• ผจก. DC-ขอนแก่น: คุณธนา</w:t>
+        <w:t>• ผจก. คลังขอนแก่น: คุณธนา</w:t>
         <w:br/>
       </w:r>
       <w:r>
@@ -91,7 +91,7 @@
         <w:br/>
       </w:r>
       <w:r>
-        <w:t>• ฝ่ายขนส่ง: คุณปกรณ์</w:t>
+        <w:t>• ฝ่ายขนส่งควบคุมอุณหภูมิควบคุมอุณหภูมิ: คุณปกรณ์</w:t>
         <w:br/>
       </w:r>
     </w:p>
@@ -174,7 +174,7 @@
           </w:tcPr>
           <w:p>
             <w:r>
-              <w:t>ปรับรอบรับสินค้า + เพิ่มจุดสแกนชั่วคราวโซนคัดแยก</w:t>
+              <w:t>ปรับรอบปล่อยล็อต QA + เพิ่มจุดตรวจเอกสารก่อนส่งยา</w:t>
             </w:r>
           </w:p>
         </w:tc>
@@ -184,7 +184,7 @@
           </w:tcPr>
           <w:p>
             <w:r>
-              <w:t>ผจก. DC-บางบัวทอง</w:t>
+              <w:t>ผจก. โรงงานรังสิต</w:t>
             </w:r>
           </w:p>
         </w:tc>
@@ -204,7 +204,7 @@
           </w:tcPr>
           <w:p>
             <w:r>
-              <w:t>ลดคอขวดช่วง peak, on-time กลับ &gt;93%</w:t>
+              <w:t>ลดเวลารอปล่อยล็อตและเพิ่ม on-time delivery &gt;95%</w:t>
             </w:r>
           </w:p>
         </w:tc>
@@ -226,7 +226,7 @@
           </w:tcPr>
           <w:p>
             <w:r>
-              <w:t>ทบทวน route รถขนส่งช่วง 16:00–20:00 และเพิ่มรถ standby</w:t>
+              <w:t>ทบทวนเส้นทางส่งยาเร่งด่วนช่วง 16:00-20:00 และเพิ่มรถควบคุมอุณหภูมิ standby</w:t>
             </w:r>
           </w:p>
         </w:tc>
@@ -236,7 +236,7 @@
           </w:tcPr>
           <w:p>
             <w:r>
-              <w:t>ฝ่ายขนส่ง</w:t>
+              <w:t>ฝ่ายขนส่งควบคุมอุณหภูมิ</w:t>
             </w:r>
           </w:p>
         </w:tc>
@@ -256,7 +256,7 @@
           </w:tcPr>
           <w:p>
             <w:r>
-              <w:t>ลดดีเลย์วัน peak</w:t>
+              <w:t>ลดความล่าช้าในรอบจัดส่งเร่งด่วน</w:t>
             </w:r>
           </w:p>
         </w:tc>
@@ -278,7 +278,7 @@
           </w:tcPr>
           <w:p>
             <w:r>
-              <w:t>ทำ 5S ทางเดินโซนคัดแยก + ป้ายเตือนความปลอดภัย</w:t>
+              <w:t>ทำ 5S โซนแพ็กยา + ป้ายเตือนเส้นทางเคลื่อนย้าย</w:t>
             </w:r>
           </w:p>
         </w:tc>
@@ -288,7 +288,7 @@
           </w:tcPr>
           <w:p>
             <w:r>
-              <w:t>Safety + ผจก. DC</w:t>
+              <w:t>Safety + ผจก. คลัง</w:t>
             </w:r>
           </w:p>
         </w:tc>
@@ -308,7 +308,7 @@
           </w:tcPr>
           <w:p>
             <w:r>
-              <w:t>ลด near-miss/incident</w:t>
+              <w:t>ลด near-miss/incident ในคลัง</w:t>
             </w:r>
           </w:p>
         </w:tc>
@@ -330,7 +330,7 @@
           </w:tcPr>
           <w:p>
             <w:r>
-              <w:t>ติดตาม vendor lead time และวางแผน buffer stock กลุ่มสินค้า A</w:t>
+              <w:t>ติดตาม lead time วัตถุดิบสำคัญและวางแผน buffer stock ยาจำเป็น</w:t>
             </w:r>
           </w:p>
         </w:tc>
@@ -340,7 +340,7 @@
           </w:tcPr>
           <w:p>
             <w:r>
-              <w:t>จัดซื้อ/Planning</w:t>
+              <w:t>จัดซื้อ/วางแผนการผลิต</w:t>
             </w:r>
           </w:p>
         </w:tc>
@@ -360,7 +360,7 @@
           </w:tcPr>
           <w:p>
             <w:r>
-              <w:t>Fill rate &gt;96%</w:t>
+              <w:t>Fill rate &gt;97%</w:t>
             </w:r>
           </w:p>
         </w:tc>

</xml_diff>